<commit_message>
docs(field-insights): Phase 2 deliverables + separate Vercel deployment guide
- docs/10-phase-2-deliverables.md
- DEPLOYMENT.md: exact Vercel setup (Root Directory=field-insights), env vars,
  isolated from VANTORA's kako/kako-fieldsync
- README status -> Phase 2; regenerated Word package

https://claude.ai/code/session_01EGZXDeuRwUJgvLDcPJPQnQ
</commit_message>
<xml_diff>
--- a/field-insights/docs/Field-Insights-Design-Package.docx
+++ b/field-insights/docs/Field-Insights-Design-Package.docx
@@ -75,23 +75,33 @@
         <w:t>Status:</w:t>
       </w:r>
       <w:r>
-        <w:t xml:space="preserve"> Phase 1 (Auth, Data Model, RBAC, Configurable Intelligence) implemented — 11 migrations applied to the separate Supabase project, configurable framework metamodel (versioned, effective-dated, company-overridable, audited) with FMCG seeded as default, RLS on every table, security hardening, Supabase Auth + typed data layer in the PWA. Builds green. </w:t>
+        <w:t xml:space="preserve"> Phase 2 implemented — offline-first sync engine (Dexie outbox), the 60-second visit capture flow, in-visit Opportunity/Issue/Action/Follow-up quick-capture, framework-driven DVAP capture, and lightweight SKU/Route/Attachments foundations (12 migrations applied). Builds green. Deploys as its </w:t>
       </w:r>
       <w:r>
         <w:rPr>
           <w:b/>
         </w:rPr>
-        <w:t>Phase 2 (visit capture + offline sync) awaits approval.</w:t>
-      </w:r>
-      <w:r>
-        <w:t xml:space="preserve"> See </w:t>
+        <w:t>own</w:t>
+      </w:r>
+      <w:r>
+        <w:t xml:space="preserve"> Vercel project (see </w:t>
       </w:r>
       <w:r>
         <w:rPr>
           <w:rFonts w:ascii="Consolas" w:hAnsi="Consolas"/>
           <w:sz w:val="18"/>
         </w:rPr>
-        <w:t>docs/09-phase-1-deliverables.md</w:t>
+        <w:t>DEPLOYMENT.md</w:t>
+      </w:r>
+      <w:r>
+        <w:t xml:space="preserve">). See </w:t>
+      </w:r>
+      <w:r>
+        <w:rPr>
+          <w:rFonts w:ascii="Consolas" w:hAnsi="Consolas"/>
+          <w:sz w:val="18"/>
+        </w:rPr>
+        <w:t>docs/10-phase-2-deliverables.md</w:t>
       </w:r>
       <w:r>
         <w:t>.</w:t>
@@ -813,6 +823,51 @@
     </w:p>
     <w:p>
       <w:pPr>
+        <w:pStyle w:val="ListNumber"/>
+      </w:pPr>
+      <w:r>
+        <w:t>[</w:t>
+      </w:r>
+      <w:r>
+        <w:rPr>
+          <w:rFonts w:ascii="Consolas" w:hAnsi="Consolas"/>
+          <w:sz w:val="18"/>
+        </w:rPr>
+        <w:t>docs/10-phase-2-deliverables.md</w:t>
+      </w:r>
+      <w:r>
+        <w:t xml:space="preserve">](docs/10-phase-2-deliverables.md) — </w:t>
+      </w:r>
+      <w:r>
+        <w:rPr>
+          <w:b/>
+        </w:rPr>
+        <w:t>Phase 2 output:</w:t>
+      </w:r>
+      <w:r>
+        <w:t xml:space="preserve"> visit capture, offline sync engine, DVAP capture, SKU/Route/Attachments foundations</w:t>
+      </w:r>
+    </w:p>
+    <w:p>
+      <w:pPr>
+        <w:pStyle w:val="ListNumber"/>
+      </w:pPr>
+      <w:r>
+        <w:t>[</w:t>
+      </w:r>
+      <w:r>
+        <w:rPr>
+          <w:rFonts w:ascii="Consolas" w:hAnsi="Consolas"/>
+          <w:sz w:val="18"/>
+        </w:rPr>
+        <w:t>DEPLOYMENT.md</w:t>
+      </w:r>
+      <w:r>
+        <w:t>](DEPLOYMENT.md) — separate Vercel deployment setup (isolated from VANTORA)</w:t>
+      </w:r>
+    </w:p>
+    <w:p>
+      <w:pPr>
         <w:pStyle w:val="Heading2"/>
       </w:pPr>
       <w:r/>
@@ -3423,6 +3478,556 @@
     <w:p>
       <w:r>
         <w:t>Visit capture flow (60-second visit), offline sync engine (Dexie queue → Supabase), DVAP capture UI driven by the configured framework, and the execution-entity quick-capture (Opportunity/Issue/Action/Follow-up) from within a visit.</w:t>
+      </w:r>
+    </w:p>
+    <w:p>
+      <w:r>
+        <w:br w:type="page"/>
+      </w:r>
+    </w:p>
+    <w:p>
+      <w:pPr>
+        <w:pStyle w:val="Heading1"/>
+      </w:pPr>
+      <w:r/>
+      <w:r>
+        <w:t>10 — Phase 2 Deliverables</w:t>
+      </w:r>
+    </w:p>
+    <w:p>
+      <w:r>
+        <w:t>Phase 2 delivers the field-capture loop, the offline-first sync engine, framework-driven DVAP capture, and three lightweight extensible foundations. Builds green (typecheck + PWA build).</w:t>
+      </w:r>
+    </w:p>
+    <w:p>
+      <w:pPr>
+        <w:pStyle w:val="Heading2"/>
+      </w:pPr>
+      <w:r/>
+      <w:r>
+        <w:t>1. Offline-first sync engine (</w:t>
+      </w:r>
+      <w:r>
+        <w:rPr>
+          <w:rFonts w:ascii="Consolas" w:hAnsi="Consolas"/>
+          <w:sz w:val="18"/>
+        </w:rPr>
+        <w:t>src/lib/db.ts</w:t>
+      </w:r>
+      <w:r>
+        <w:t xml:space="preserve">, </w:t>
+      </w:r>
+      <w:r>
+        <w:rPr>
+          <w:rFonts w:ascii="Consolas" w:hAnsi="Consolas"/>
+          <w:sz w:val="18"/>
+        </w:rPr>
+        <w:t>src/lib/sync.ts</w:t>
+      </w:r>
+      <w:r>
+        <w:t>)</w:t>
+      </w:r>
+    </w:p>
+    <w:p>
+      <w:pPr>
+        <w:pStyle w:val="ListBullet"/>
+      </w:pPr>
+      <w:r>
+        <w:rPr>
+          <w:b/>
+        </w:rPr>
+        <w:t>Dexie (IndexedDB)</w:t>
+      </w:r>
+      <w:r>
+        <w:t xml:space="preserve"> local store: </w:t>
+      </w:r>
+      <w:r>
+        <w:rPr>
+          <w:rFonts w:ascii="Consolas" w:hAnsi="Consolas"/>
+          <w:sz w:val="18"/>
+        </w:rPr>
+        <w:t>visits</w:t>
+      </w:r>
+      <w:r>
+        <w:t xml:space="preserve"> cache + a generic </w:t>
+      </w:r>
+      <w:r>
+        <w:rPr>
+          <w:b/>
+        </w:rPr>
+        <w:t>outbox</w:t>
+      </w:r>
+      <w:r>
+        <w:t xml:space="preserve"> queue.</w:t>
+      </w:r>
+    </w:p>
+    <w:p>
+      <w:pPr>
+        <w:pStyle w:val="ListBullet"/>
+      </w:pPr>
+      <w:r>
+        <w:rPr>
+          <w:rFonts w:ascii="Consolas" w:hAnsi="Consolas"/>
+          <w:sz w:val="18"/>
+        </w:rPr>
+        <w:t>enqueue(table, op, payload)</w:t>
+      </w:r>
+      <w:r>
+        <w:t xml:space="preserve"> writes the mutation locally; every record uses a </w:t>
+      </w:r>
+      <w:r>
+        <w:rPr>
+          <w:b/>
+        </w:rPr>
+        <w:t>client-generated UUID</w:t>
+      </w:r>
+      <w:r>
+        <w:t xml:space="preserve"> so flushes are </w:t>
+      </w:r>
+      <w:r>
+        <w:rPr>
+          <w:b/>
+        </w:rPr>
+        <w:t>idempotent</w:t>
+      </w:r>
+      <w:r>
+        <w:t xml:space="preserve"> (insert = upsert on </w:t>
+      </w:r>
+      <w:r>
+        <w:rPr>
+          <w:rFonts w:ascii="Consolas" w:hAnsi="Consolas"/>
+          <w:sz w:val="18"/>
+        </w:rPr>
+        <w:t>id</w:t>
+      </w:r>
+      <w:r>
+        <w:t>).</w:t>
+      </w:r>
+    </w:p>
+    <w:p>
+      <w:pPr>
+        <w:pStyle w:val="ListBullet"/>
+      </w:pPr>
+      <w:r>
+        <w:rPr>
+          <w:rFonts w:ascii="Consolas" w:hAnsi="Consolas"/>
+          <w:sz w:val="18"/>
+        </w:rPr>
+        <w:t>flushQueue()</w:t>
+      </w:r>
+      <w:r>
+        <w:t xml:space="preserve"> pushes pending mutations to Supabase; on error it records the message and retries later. Auto-flush on mount, on </w:t>
+      </w:r>
+      <w:r>
+        <w:rPr>
+          <w:rFonts w:ascii="Consolas" w:hAnsi="Consolas"/>
+          <w:sz w:val="18"/>
+        </w:rPr>
+        <w:t>online</w:t>
+      </w:r>
+      <w:r>
+        <w:t>, and every 30s.</w:t>
+      </w:r>
+    </w:p>
+    <w:p>
+      <w:pPr>
+        <w:pStyle w:val="ListBullet"/>
+      </w:pPr>
+      <w:r>
+        <w:rPr>
+          <w:rFonts w:ascii="Consolas" w:hAnsi="Consolas"/>
+          <w:sz w:val="18"/>
+        </w:rPr>
+        <w:t>useSyncEngine()</w:t>
+      </w:r>
+      <w:r>
+        <w:t xml:space="preserve"> exposes the pending count; the shell shows a sync badge.</w:t>
+      </w:r>
+    </w:p>
+    <w:p>
+      <w:pPr>
+        <w:pStyle w:val="Heading2"/>
+      </w:pPr>
+      <w:r/>
+      <w:r>
+        <w:t>2. The 60-second visit (</w:t>
+      </w:r>
+      <w:r>
+        <w:rPr>
+          <w:rFonts w:ascii="Consolas" w:hAnsi="Consolas"/>
+          <w:sz w:val="18"/>
+        </w:rPr>
+        <w:t>StartVisitPage</w:t>
+      </w:r>
+      <w:r>
+        <w:t>)</w:t>
+      </w:r>
+    </w:p>
+    <w:p>
+      <w:pPr>
+        <w:pStyle w:val="ListBullet"/>
+      </w:pPr>
+      <w:r>
+        <w:t xml:space="preserve">Select customer, capture GPS (geolocation hook), choose visit type, optional objective → </w:t>
+      </w:r>
+      <w:r>
+        <w:rPr>
+          <w:b/>
+        </w:rPr>
+        <w:t>Save</w:t>
+      </w:r>
+      <w:r>
+        <w:t xml:space="preserve"> writes locally and navigates to the visit hub instantly (no network needed).</w:t>
+      </w:r>
+    </w:p>
+    <w:p>
+      <w:pPr>
+        <w:pStyle w:val="Heading2"/>
+      </w:pPr>
+      <w:r/>
+      <w:r>
+        <w:t>3. Visit hub + quick capture (</w:t>
+      </w:r>
+      <w:r>
+        <w:rPr>
+          <w:rFonts w:ascii="Consolas" w:hAnsi="Consolas"/>
+          <w:sz w:val="18"/>
+        </w:rPr>
+        <w:t>VisitDetailPage</w:t>
+      </w:r>
+      <w:r>
+        <w:t>)</w:t>
+      </w:r>
+    </w:p>
+    <w:p>
+      <w:pPr>
+        <w:pStyle w:val="ListBullet"/>
+      </w:pPr>
+      <w:r>
+        <w:t xml:space="preserve">One-tap capture of </w:t>
+      </w:r>
+      <w:r>
+        <w:rPr>
+          <w:b/>
+        </w:rPr>
+        <w:t>Opportunity, Issue, Action, Follow-up</w:t>
+      </w:r>
+      <w:r>
+        <w:t xml:space="preserve"> — all offline-first via the outbox, anchored to the visit (and customer).</w:t>
+      </w:r>
+    </w:p>
+    <w:p>
+      <w:pPr>
+        <w:pStyle w:val="ListBullet"/>
+      </w:pPr>
+      <w:r>
+        <w:rPr>
+          <w:b/>
+        </w:rPr>
+        <w:t>End visit</w:t>
+      </w:r>
+      <w:r>
+        <w:t xml:space="preserve"> records summary/outcome; the server trigger recomputes Visit Quality + Customer Health on completion.</w:t>
+      </w:r>
+    </w:p>
+    <w:p>
+      <w:pPr>
+        <w:pStyle w:val="Heading2"/>
+      </w:pPr>
+      <w:r/>
+      <w:r>
+        <w:t>4. Framework-driven DVAP capture</w:t>
+      </w:r>
+    </w:p>
+    <w:p>
+      <w:pPr>
+        <w:pStyle w:val="ListBullet"/>
+      </w:pPr>
+      <w:r>
+        <w:t xml:space="preserve">Loads the active default </w:t>
+      </w:r>
+      <w:r>
+        <w:rPr>
+          <w:b/>
+        </w:rPr>
+        <w:t>DVAP assessment framework</w:t>
+      </w:r>
+      <w:r>
+        <w:t xml:space="preserve"> (dimensions, weights, bands) from the config metamodel — no hardcoded dimensions.</w:t>
+      </w:r>
+    </w:p>
+    <w:p>
+      <w:pPr>
+        <w:pStyle w:val="ListBullet"/>
+      </w:pPr>
+      <w:r>
+        <w:t xml:space="preserve">Captures 0–100 per dimension; computes overall + band </w:t>
+      </w:r>
+      <w:r>
+        <w:rPr>
+          <w:b/>
+        </w:rPr>
+        <w:t>client-side</w:t>
+      </w:r>
+      <w:r>
+        <w:t xml:space="preserve"> (mirrors </w:t>
+      </w:r>
+      <w:r>
+        <w:rPr>
+          <w:rFonts w:ascii="Consolas" w:hAnsi="Consolas"/>
+          <w:sz w:val="18"/>
+        </w:rPr>
+        <w:t>fi_recompute_assessment</w:t>
+      </w:r>
+      <w:r>
+        <w:t xml:space="preserve">) for instant, offline results; saves </w:t>
+      </w:r>
+      <w:r>
+        <w:rPr>
+          <w:rFonts w:ascii="Consolas" w:hAnsi="Consolas"/>
+          <w:sz w:val="18"/>
+        </w:rPr>
+        <w:t>assessments</w:t>
+      </w:r>
+      <w:r>
+        <w:t xml:space="preserve"> + </w:t>
+      </w:r>
+      <w:r>
+        <w:rPr>
+          <w:rFonts w:ascii="Consolas" w:hAnsi="Consolas"/>
+          <w:sz w:val="18"/>
+        </w:rPr>
+        <w:t>assessment_scores</w:t>
+      </w:r>
+      <w:r>
+        <w:t xml:space="preserve"> via the queue.</w:t>
+      </w:r>
+    </w:p>
+    <w:p>
+      <w:pPr>
+        <w:pStyle w:val="Heading2"/>
+      </w:pPr>
+      <w:r/>
+      <w:r>
+        <w:t xml:space="preserve">5. Lightweight foundations (migration </w:t>
+      </w:r>
+      <w:r>
+        <w:rPr>
+          <w:rFonts w:ascii="Consolas" w:hAnsi="Consolas"/>
+          <w:sz w:val="18"/>
+        </w:rPr>
+        <w:t>0012</w:t>
+      </w:r>
+      <w:r>
+        <w:t>, additive)</w:t>
+      </w:r>
+    </w:p>
+    <w:p>
+      <w:pPr>
+        <w:pStyle w:val="ListBullet"/>
+      </w:pPr>
+      <w:r>
+        <w:rPr>
+          <w:b/>
+        </w:rPr>
+        <w:t>SKU Intelligence:</w:t>
+      </w:r>
+      <w:r>
+        <w:t xml:space="preserve"> </w:t>
+      </w:r>
+      <w:r>
+        <w:rPr>
+          <w:rFonts w:ascii="Consolas" w:hAnsi="Consolas"/>
+          <w:sz w:val="18"/>
+        </w:rPr>
+        <w:t>skus</w:t>
+      </w:r>
+      <w:r>
+        <w:t xml:space="preserve"> catalog (code, name, brand, category, pack size, barcode) + </w:t>
+      </w:r>
+      <w:r>
+        <w:rPr>
+          <w:rFonts w:ascii="Consolas" w:hAnsi="Consolas"/>
+          <w:sz w:val="18"/>
+        </w:rPr>
+        <w:t>competitor_price_points.sku_id</w:t>
+      </w:r>
+      <w:r>
+        <w:t xml:space="preserve"> link. Extensible toward availability/price analytics.</w:t>
+      </w:r>
+    </w:p>
+    <w:p>
+      <w:pPr>
+        <w:pStyle w:val="ListBullet"/>
+      </w:pPr>
+      <w:r>
+        <w:rPr>
+          <w:b/>
+        </w:rPr>
+        <w:t>Route Performance:</w:t>
+      </w:r>
+      <w:r>
+        <w:t xml:space="preserve"> </w:t>
+      </w:r>
+      <w:r>
+        <w:rPr>
+          <w:rFonts w:ascii="Consolas" w:hAnsi="Consolas"/>
+          <w:sz w:val="18"/>
+        </w:rPr>
+        <w:t>routes</w:t>
+      </w:r>
+      <w:r>
+        <w:t xml:space="preserve"> + </w:t>
+      </w:r>
+      <w:r>
+        <w:rPr>
+          <w:rFonts w:ascii="Consolas" w:hAnsi="Consolas"/>
+          <w:sz w:val="18"/>
+        </w:rPr>
+        <w:t>route_stops</w:t>
+      </w:r>
+      <w:r>
+        <w:t xml:space="preserve"> (planned vs visited) + </w:t>
+      </w:r>
+      <w:r>
+        <w:rPr>
+          <w:rFonts w:ascii="Consolas" w:hAnsi="Consolas"/>
+          <w:sz w:val="18"/>
+        </w:rPr>
+        <w:t>v_route_performance</w:t>
+      </w:r>
+      <w:r>
+        <w:t xml:space="preserve"> view (completion %). A completed stop links to its </w:t>
+      </w:r>
+      <w:r>
+        <w:rPr>
+          <w:rFonts w:ascii="Consolas" w:hAnsi="Consolas"/>
+          <w:sz w:val="18"/>
+        </w:rPr>
+        <w:t>visit_id</w:t>
+      </w:r>
+      <w:r>
+        <w:t>.</w:t>
+      </w:r>
+    </w:p>
+    <w:p>
+      <w:pPr>
+        <w:pStyle w:val="ListBullet"/>
+      </w:pPr>
+      <w:r>
+        <w:rPr>
+          <w:b/>
+        </w:rPr>
+        <w:t>Generic Attachments:</w:t>
+      </w:r>
+      <w:r>
+        <w:t xml:space="preserve"> polymorphic </w:t>
+      </w:r>
+      <w:r>
+        <w:rPr>
+          <w:rFonts w:ascii="Consolas" w:hAnsi="Consolas"/>
+          <w:sz w:val="18"/>
+        </w:rPr>
+        <w:t>attachments</w:t>
+      </w:r>
+      <w:r>
+        <w:t xml:space="preserve"> (entity_type/entity_id + storage path/kind/mime/size). Attach files to any entity.</w:t>
+      </w:r>
+    </w:p>
+    <w:p>
+      <w:pPr>
+        <w:pStyle w:val="ListBullet"/>
+      </w:pPr>
+      <w:r>
+        <w:t>All three have RLS and are intentionally minimal and extensible.</w:t>
+      </w:r>
+    </w:p>
+    <w:p>
+      <w:pPr>
+        <w:pStyle w:val="Heading2"/>
+      </w:pPr>
+      <w:r/>
+      <w:r>
+        <w:t>6. Deployment</w:t>
+      </w:r>
+    </w:p>
+    <w:p>
+      <w:r>
+        <w:t xml:space="preserve">Field Insights deploys as its </w:t>
+      </w:r>
+      <w:r>
+        <w:rPr>
+          <w:b/>
+        </w:rPr>
+        <w:t>own</w:t>
+      </w:r>
+      <w:r>
+        <w:t xml:space="preserve"> Vercel project (see </w:t>
+      </w:r>
+      <w:r>
+        <w:rPr>
+          <w:rFonts w:ascii="Consolas" w:hAnsi="Consolas"/>
+          <w:sz w:val="18"/>
+        </w:rPr>
+        <w:t>DEPLOYMENT.md</w:t>
+      </w:r>
+      <w:r>
+        <w:t xml:space="preserve">) — Root Directory </w:t>
+      </w:r>
+      <w:r>
+        <w:rPr>
+          <w:rFonts w:ascii="Consolas" w:hAnsi="Consolas"/>
+          <w:sz w:val="18"/>
+        </w:rPr>
+        <w:t>field-insights</w:t>
+      </w:r>
+      <w:r>
+        <w:t xml:space="preserve">, separate from VANTORA's </w:t>
+      </w:r>
+      <w:r>
+        <w:rPr>
+          <w:rFonts w:ascii="Consolas" w:hAnsi="Consolas"/>
+          <w:sz w:val="18"/>
+        </w:rPr>
+        <w:t>kako</w:t>
+      </w:r>
+      <w:r>
+        <w:t>/</w:t>
+      </w:r>
+      <w:r>
+        <w:rPr>
+          <w:rFonts w:ascii="Consolas" w:hAnsi="Consolas"/>
+          <w:sz w:val="18"/>
+        </w:rPr>
+        <w:t>kako-fieldsync</w:t>
+      </w:r>
+      <w:r>
+        <w:t>.</w:t>
+      </w:r>
+    </w:p>
+    <w:p>
+      <w:pPr>
+        <w:pStyle w:val="Heading2"/>
+      </w:pPr>
+      <w:r/>
+      <w:r>
+        <w:t>Notes / next increments</w:t>
+      </w:r>
+    </w:p>
+    <w:p>
+      <w:pPr>
+        <w:pStyle w:val="ListBullet"/>
+      </w:pPr>
+      <w:r>
+        <w:t>Child entities created offline sync to the server and appear in lists after flush; full offline mirroring of every entity type is an incremental enhancement.</w:t>
+      </w:r>
+    </w:p>
+    <w:p>
+      <w:pPr>
+        <w:pStyle w:val="ListBullet"/>
+      </w:pPr>
+      <w:r>
+        <w:t>Photo/voice blob upload to Storage, the visits map, dashboards, and reports are later phases.</w:t>
       </w:r>
     </w:p>
     <w:p>
@@ -22595,6 +23200,691 @@
       </w:tr>
     </w:tbl>
     <w:p/>
+    <w:p>
+      <w:r>
+        <w:br w:type="page"/>
+      </w:r>
+    </w:p>
+    <w:p>
+      <w:pPr>
+        <w:pStyle w:val="Heading1"/>
+      </w:pPr>
+      <w:r/>
+      <w:r>
+        <w:t>Field Insights — Deployment (separate from VANTORA)</w:t>
+      </w:r>
+    </w:p>
+    <w:p>
+      <w:r>
+        <w:t xml:space="preserve">Field Insights deploys as its </w:t>
+      </w:r>
+      <w:r>
+        <w:rPr>
+          <w:b/>
+        </w:rPr>
+        <w:t>own</w:t>
+      </w:r>
+      <w:r>
+        <w:t xml:space="preserve"> Vercel project, fully isolated from VANTORA's </w:t>
+      </w:r>
+      <w:r>
+        <w:rPr>
+          <w:rFonts w:ascii="Consolas" w:hAnsi="Consolas"/>
+          <w:sz w:val="18"/>
+        </w:rPr>
+        <w:t>kako</w:t>
+      </w:r>
+      <w:r>
+        <w:t xml:space="preserve"> / </w:t>
+      </w:r>
+      <w:r>
+        <w:rPr>
+          <w:rFonts w:ascii="Consolas" w:hAnsi="Consolas"/>
+          <w:sz w:val="18"/>
+        </w:rPr>
+        <w:t>kako-fieldsync</w:t>
+      </w:r>
+      <w:r>
+        <w:t xml:space="preserve"> projects. Do </w:t>
+      </w:r>
+      <w:r>
+        <w:rPr>
+          <w:b/>
+        </w:rPr>
+        <w:t>not</w:t>
+      </w:r>
+      <w:r>
+        <w:t xml:space="preserve"> change those, and do </w:t>
+      </w:r>
+      <w:r>
+        <w:rPr>
+          <w:b/>
+        </w:rPr>
+        <w:t>not</w:t>
+      </w:r>
+      <w:r>
+        <w:t xml:space="preserve"> deploy from the repo root.</w:t>
+      </w:r>
+    </w:p>
+    <w:p>
+      <w:pPr>
+        <w:pStyle w:val="Heading2"/>
+      </w:pPr>
+      <w:r/>
+      <w:r>
+        <w:t>Vercel project setup (exact values)</w:t>
+      </w:r>
+    </w:p>
+    <w:p>
+      <w:r>
+        <w:t xml:space="preserve">Create a </w:t>
+      </w:r>
+      <w:r>
+        <w:rPr>
+          <w:b/>
+        </w:rPr>
+        <w:t>new</w:t>
+      </w:r>
+      <w:r>
+        <w:t xml:space="preserve"> Vercel project, importing the same GitHub repo (</w:t>
+      </w:r>
+      <w:r>
+        <w:rPr>
+          <w:rFonts w:ascii="Consolas" w:hAnsi="Consolas"/>
+          <w:sz w:val="18"/>
+        </w:rPr>
+        <w:t>nabilhahaha/Kako</w:t>
+      </w:r>
+      <w:r>
+        <w:t>).</w:t>
+      </w:r>
+    </w:p>
+    <w:tbl>
+      <w:tblPr>
+        <w:tblStyle w:val="LightGrid-Accent1"/>
+        <w:tblW w:type="auto" w:w="0"/>
+        <w:jc w:val="left"/>
+        <w:tblLook w:firstColumn="1" w:firstRow="1" w:lastColumn="0" w:lastRow="0" w:noHBand="0" w:noVBand="1" w:val="04A0"/>
+      </w:tblPr>
+      <w:tblGrid>
+        <w:gridCol w:w="4320"/>
+        <w:gridCol w:w="4320"/>
+      </w:tblGrid>
+      <w:tr>
+        <w:tc>
+          <w:tcPr>
+            <w:tcW w:type="dxa" w:w="4320"/>
+          </w:tcPr>
+          <w:p>
+            <w:r>
+              <w:rPr>
+                <w:b/>
+              </w:rPr>
+            </w:r>
+            <w:r>
+              <w:rPr>
+                <w:b/>
+              </w:rPr>
+              <w:t>Setting</w:t>
+            </w:r>
+          </w:p>
+        </w:tc>
+        <w:tc>
+          <w:tcPr>
+            <w:tcW w:type="dxa" w:w="4320"/>
+          </w:tcPr>
+          <w:p>
+            <w:r>
+              <w:rPr>
+                <w:b/>
+              </w:rPr>
+            </w:r>
+            <w:r>
+              <w:rPr>
+                <w:b/>
+              </w:rPr>
+              <w:t>Value</w:t>
+            </w:r>
+          </w:p>
+        </w:tc>
+      </w:tr>
+      <w:tr>
+        <w:tc>
+          <w:tcPr>
+            <w:tcW w:type="dxa" w:w="4320"/>
+          </w:tcPr>
+          <w:p>
+            <w:r/>
+            <w:r>
+              <w:rPr>
+                <w:b/>
+              </w:rPr>
+              <w:t>Project name</w:t>
+            </w:r>
+          </w:p>
+        </w:tc>
+        <w:tc>
+          <w:tcPr>
+            <w:tcW w:type="dxa" w:w="4320"/>
+          </w:tcPr>
+          <w:p>
+            <w:r/>
+            <w:r>
+              <w:rPr>
+                <w:rFonts w:ascii="Consolas" w:hAnsi="Consolas"/>
+                <w:sz w:val="18"/>
+              </w:rPr>
+              <w:t>field-insights</w:t>
+            </w:r>
+          </w:p>
+        </w:tc>
+      </w:tr>
+      <w:tr>
+        <w:tc>
+          <w:tcPr>
+            <w:tcW w:type="dxa" w:w="4320"/>
+          </w:tcPr>
+          <w:p>
+            <w:r/>
+            <w:r>
+              <w:rPr>
+                <w:b/>
+              </w:rPr>
+              <w:t>Framework preset</w:t>
+            </w:r>
+          </w:p>
+        </w:tc>
+        <w:tc>
+          <w:tcPr>
+            <w:tcW w:type="dxa" w:w="4320"/>
+          </w:tcPr>
+          <w:p>
+            <w:r/>
+            <w:r>
+              <w:t>Vite</w:t>
+            </w:r>
+          </w:p>
+        </w:tc>
+      </w:tr>
+      <w:tr>
+        <w:tc>
+          <w:tcPr>
+            <w:tcW w:type="dxa" w:w="4320"/>
+          </w:tcPr>
+          <w:p>
+            <w:r/>
+            <w:r>
+              <w:rPr>
+                <w:b/>
+              </w:rPr>
+              <w:t>Root Directory</w:t>
+            </w:r>
+          </w:p>
+        </w:tc>
+        <w:tc>
+          <w:tcPr>
+            <w:tcW w:type="dxa" w:w="4320"/>
+          </w:tcPr>
+          <w:p>
+            <w:r/>
+            <w:r>
+              <w:rPr>
+                <w:rFonts w:ascii="Consolas" w:hAnsi="Consolas"/>
+                <w:sz w:val="18"/>
+              </w:rPr>
+              <w:t>field-insights</w:t>
+            </w:r>
+            <w:r>
+              <w:t xml:space="preserve">  ← the critical setting</w:t>
+            </w:r>
+          </w:p>
+        </w:tc>
+      </w:tr>
+      <w:tr>
+        <w:tc>
+          <w:tcPr>
+            <w:tcW w:type="dxa" w:w="4320"/>
+          </w:tcPr>
+          <w:p>
+            <w:r/>
+            <w:r>
+              <w:rPr>
+                <w:b/>
+              </w:rPr>
+              <w:t>Build Command</w:t>
+            </w:r>
+          </w:p>
+        </w:tc>
+        <w:tc>
+          <w:tcPr>
+            <w:tcW w:type="dxa" w:w="4320"/>
+          </w:tcPr>
+          <w:p>
+            <w:r/>
+            <w:r>
+              <w:rPr>
+                <w:rFonts w:ascii="Consolas" w:hAnsi="Consolas"/>
+                <w:sz w:val="18"/>
+              </w:rPr>
+              <w:t>npm run build</w:t>
+            </w:r>
+          </w:p>
+        </w:tc>
+      </w:tr>
+      <w:tr>
+        <w:tc>
+          <w:tcPr>
+            <w:tcW w:type="dxa" w:w="4320"/>
+          </w:tcPr>
+          <w:p>
+            <w:r/>
+            <w:r>
+              <w:rPr>
+                <w:b/>
+              </w:rPr>
+              <w:t>Install Command</w:t>
+            </w:r>
+          </w:p>
+        </w:tc>
+        <w:tc>
+          <w:tcPr>
+            <w:tcW w:type="dxa" w:w="4320"/>
+          </w:tcPr>
+          <w:p>
+            <w:r/>
+            <w:r>
+              <w:rPr>
+                <w:rFonts w:ascii="Consolas" w:hAnsi="Consolas"/>
+                <w:sz w:val="18"/>
+              </w:rPr>
+              <w:t>npm install</w:t>
+            </w:r>
+          </w:p>
+        </w:tc>
+      </w:tr>
+      <w:tr>
+        <w:tc>
+          <w:tcPr>
+            <w:tcW w:type="dxa" w:w="4320"/>
+          </w:tcPr>
+          <w:p>
+            <w:r/>
+            <w:r>
+              <w:rPr>
+                <w:b/>
+              </w:rPr>
+              <w:t>Output Directory</w:t>
+            </w:r>
+          </w:p>
+        </w:tc>
+        <w:tc>
+          <w:tcPr>
+            <w:tcW w:type="dxa" w:w="4320"/>
+          </w:tcPr>
+          <w:p>
+            <w:r/>
+            <w:r>
+              <w:rPr>
+                <w:rFonts w:ascii="Consolas" w:hAnsi="Consolas"/>
+                <w:sz w:val="18"/>
+              </w:rPr>
+              <w:t>dist</w:t>
+            </w:r>
+            <w:r>
+              <w:t xml:space="preserve"> (resolves to </w:t>
+            </w:r>
+            <w:r>
+              <w:rPr>
+                <w:rFonts w:ascii="Consolas" w:hAnsi="Consolas"/>
+                <w:sz w:val="18"/>
+              </w:rPr>
+              <w:t>field-insights/dist</w:t>
+            </w:r>
+            <w:r>
+              <w:t>)</w:t>
+            </w:r>
+          </w:p>
+        </w:tc>
+      </w:tr>
+      <w:tr>
+        <w:tc>
+          <w:tcPr>
+            <w:tcW w:type="dxa" w:w="4320"/>
+          </w:tcPr>
+          <w:p>
+            <w:r/>
+            <w:r>
+              <w:rPr>
+                <w:b/>
+              </w:rPr>
+              <w:t>Node.js version</w:t>
+            </w:r>
+          </w:p>
+        </w:tc>
+        <w:tc>
+          <w:tcPr>
+            <w:tcW w:type="dxa" w:w="4320"/>
+          </w:tcPr>
+          <w:p>
+            <w:r/>
+            <w:r>
+              <w:t>22.x</w:t>
+            </w:r>
+          </w:p>
+        </w:tc>
+      </w:tr>
+      <w:tr>
+        <w:tc>
+          <w:tcPr>
+            <w:tcW w:type="dxa" w:w="4320"/>
+          </w:tcPr>
+          <w:p>
+            <w:r/>
+            <w:r>
+              <w:rPr>
+                <w:b/>
+              </w:rPr>
+              <w:t>Production branch</w:t>
+            </w:r>
+          </w:p>
+        </w:tc>
+        <w:tc>
+          <w:tcPr>
+            <w:tcW w:type="dxa" w:w="4320"/>
+          </w:tcPr>
+          <w:p>
+            <w:r/>
+            <w:r>
+              <w:rPr>
+                <w:rFonts w:ascii="Consolas" w:hAnsi="Consolas"/>
+                <w:sz w:val="18"/>
+              </w:rPr>
+              <w:t>claude/field-insights-new-project-5w7gg9</w:t>
+            </w:r>
+            <w:r>
+              <w:t xml:space="preserve"> (until merged to main)</w:t>
+            </w:r>
+          </w:p>
+        </w:tc>
+      </w:tr>
+    </w:tbl>
+    <w:p/>
+    <w:p>
+      <w:pPr>
+        <w:pStyle w:val="IntenseQuote"/>
+      </w:pPr>
+      <w:r>
+        <w:t xml:space="preserve">With Root Directory = </w:t>
+      </w:r>
+      <w:r>
+        <w:rPr>
+          <w:rFonts w:ascii="Consolas" w:hAnsi="Consolas"/>
+          <w:sz w:val="18"/>
+        </w:rPr>
+        <w:t>field-insights</w:t>
+      </w:r>
+      <w:r>
+        <w:t xml:space="preserve">, Vercel reads </w:t>
+      </w:r>
+      <w:r>
+        <w:rPr>
+          <w:rFonts w:ascii="Consolas" w:hAnsi="Consolas"/>
+          <w:sz w:val="18"/>
+        </w:rPr>
+        <w:t>field-insights/vercel.json</w:t>
+      </w:r>
+      <w:r>
+        <w:t xml:space="preserve"> (SPA rewrites + build/output) and builds only this app.</w:t>
+      </w:r>
+    </w:p>
+    <w:p>
+      <w:pPr>
+        <w:pStyle w:val="Heading2"/>
+      </w:pPr>
+      <w:r/>
+      <w:r>
+        <w:t>Environment variables (Production + Preview)</w:t>
+      </w:r>
+    </w:p>
+    <w:tbl>
+      <w:tblPr>
+        <w:tblStyle w:val="LightGrid-Accent1"/>
+        <w:tblW w:type="auto" w:w="0"/>
+        <w:jc w:val="left"/>
+        <w:tblLook w:firstColumn="1" w:firstRow="1" w:lastColumn="0" w:lastRow="0" w:noHBand="0" w:noVBand="1" w:val="04A0"/>
+      </w:tblPr>
+      <w:tblGrid>
+        <w:gridCol w:w="4320"/>
+        <w:gridCol w:w="4320"/>
+      </w:tblGrid>
+      <w:tr>
+        <w:tc>
+          <w:tcPr>
+            <w:tcW w:type="dxa" w:w="4320"/>
+          </w:tcPr>
+          <w:p>
+            <w:r>
+              <w:rPr>
+                <w:b/>
+              </w:rPr>
+            </w:r>
+            <w:r>
+              <w:rPr>
+                <w:b/>
+              </w:rPr>
+              <w:t>Key</w:t>
+            </w:r>
+          </w:p>
+        </w:tc>
+        <w:tc>
+          <w:tcPr>
+            <w:tcW w:type="dxa" w:w="4320"/>
+          </w:tcPr>
+          <w:p>
+            <w:r>
+              <w:rPr>
+                <w:b/>
+              </w:rPr>
+            </w:r>
+            <w:r>
+              <w:rPr>
+                <w:b/>
+              </w:rPr>
+              <w:t>Value</w:t>
+            </w:r>
+          </w:p>
+        </w:tc>
+      </w:tr>
+      <w:tr>
+        <w:tc>
+          <w:tcPr>
+            <w:tcW w:type="dxa" w:w="4320"/>
+          </w:tcPr>
+          <w:p>
+            <w:r/>
+            <w:r>
+              <w:rPr>
+                <w:rFonts w:ascii="Consolas" w:hAnsi="Consolas"/>
+                <w:sz w:val="18"/>
+              </w:rPr>
+              <w:t>VITE_FI_SUPABASE_URL</w:t>
+            </w:r>
+          </w:p>
+        </w:tc>
+        <w:tc>
+          <w:tcPr>
+            <w:tcW w:type="dxa" w:w="4320"/>
+          </w:tcPr>
+          <w:p>
+            <w:r/>
+            <w:r>
+              <w:rPr>
+                <w:rFonts w:ascii="Consolas" w:hAnsi="Consolas"/>
+                <w:sz w:val="18"/>
+              </w:rPr>
+              <w:t>https://qulukfxuaklhcztchrbv.supabase.co</w:t>
+            </w:r>
+          </w:p>
+        </w:tc>
+      </w:tr>
+      <w:tr>
+        <w:tc>
+          <w:tcPr>
+            <w:tcW w:type="dxa" w:w="4320"/>
+          </w:tcPr>
+          <w:p>
+            <w:r/>
+            <w:r>
+              <w:rPr>
+                <w:rFonts w:ascii="Consolas" w:hAnsi="Consolas"/>
+                <w:sz w:val="18"/>
+              </w:rPr>
+              <w:t>VITE_FI_SUPABASE_PUBLISHABLE_KEY</w:t>
+            </w:r>
+          </w:p>
+        </w:tc>
+        <w:tc>
+          <w:tcPr>
+            <w:tcW w:type="dxa" w:w="4320"/>
+          </w:tcPr>
+          <w:p>
+            <w:r/>
+            <w:r>
+              <w:rPr>
+                <w:rFonts w:ascii="Consolas" w:hAnsi="Consolas"/>
+                <w:sz w:val="18"/>
+              </w:rPr>
+              <w:t>sb_publishable_ELT1I44b4KT2MLpQ1p9HOQ_GVS0qLhr</w:t>
+            </w:r>
+          </w:p>
+        </w:tc>
+      </w:tr>
+      <w:tr>
+        <w:tc>
+          <w:tcPr>
+            <w:tcW w:type="dxa" w:w="4320"/>
+          </w:tcPr>
+          <w:p>
+            <w:r/>
+            <w:r>
+              <w:rPr>
+                <w:rFonts w:ascii="Consolas" w:hAnsi="Consolas"/>
+                <w:sz w:val="18"/>
+              </w:rPr>
+              <w:t>VITE_FI_APP_NAME</w:t>
+            </w:r>
+          </w:p>
+        </w:tc>
+        <w:tc>
+          <w:tcPr>
+            <w:tcW w:type="dxa" w:w="4320"/>
+          </w:tcPr>
+          <w:p>
+            <w:r/>
+            <w:r>
+              <w:rPr>
+                <w:rFonts w:ascii="Consolas" w:hAnsi="Consolas"/>
+                <w:sz w:val="18"/>
+              </w:rPr>
+              <w:t>Field Insights</w:t>
+            </w:r>
+          </w:p>
+        </w:tc>
+      </w:tr>
+    </w:tbl>
+    <w:p/>
+    <w:p>
+      <w:r>
+        <w:t xml:space="preserve">The publishable key is a public client key (safe in the browser). These are intentionally namespaced </w:t>
+      </w:r>
+      <w:r>
+        <w:rPr>
+          <w:rFonts w:ascii="Consolas" w:hAnsi="Consolas"/>
+          <w:sz w:val="18"/>
+        </w:rPr>
+        <w:t>VITE_FI_*</w:t>
+      </w:r>
+      <w:r>
+        <w:t xml:space="preserve"> so they never collide with VANTORA's </w:t>
+      </w:r>
+      <w:r>
+        <w:rPr>
+          <w:rFonts w:ascii="Consolas" w:hAnsi="Consolas"/>
+          <w:sz w:val="18"/>
+        </w:rPr>
+        <w:t>VITE_SUPABASE_*</w:t>
+      </w:r>
+      <w:r>
+        <w:t>.</w:t>
+      </w:r>
+    </w:p>
+    <w:p>
+      <w:pPr>
+        <w:pStyle w:val="Heading2"/>
+      </w:pPr>
+      <w:r/>
+      <w:r>
+        <w:t>Verify (after the project is created)</w:t>
+      </w:r>
+    </w:p>
+    <w:p>
+      <w:pPr>
+        <w:pStyle w:val="ListNumber"/>
+      </w:pPr>
+      <w:r>
+        <w:t>Open the new project's preview/production URL.</w:t>
+      </w:r>
+    </w:p>
+    <w:p>
+      <w:pPr>
+        <w:pStyle w:val="ListNumber"/>
+      </w:pPr>
+      <w:r>
+        <w:t xml:space="preserve">You should see the </w:t>
+      </w:r>
+      <w:r>
+        <w:rPr>
+          <w:b/>
+        </w:rPr>
+        <w:t>Field Insights</w:t>
+      </w:r>
+      <w:r>
+        <w:t xml:space="preserve"> sign-in screen (navy theme), not the Trade Spend Platform.</w:t>
+      </w:r>
+    </w:p>
+    <w:p>
+      <w:pPr>
+        <w:pStyle w:val="ListNumber"/>
+      </w:pPr>
+      <w:r>
+        <w:t>The page title is "Field Insights"; the app installs as a PWA.</w:t>
+      </w:r>
+    </w:p>
+    <w:p>
+      <w:r>
+        <w:t xml:space="preserve">VANTORA's </w:t>
+      </w:r>
+      <w:r>
+        <w:rPr>
+          <w:rFonts w:ascii="Consolas" w:hAnsi="Consolas"/>
+          <w:sz w:val="18"/>
+        </w:rPr>
+        <w:t>kako</w:t>
+      </w:r>
+      <w:r>
+        <w:t xml:space="preserve"> and </w:t>
+      </w:r>
+      <w:r>
+        <w:rPr>
+          <w:rFonts w:ascii="Consolas" w:hAnsi="Consolas"/>
+          <w:sz w:val="18"/>
+        </w:rPr>
+        <w:t>kako-fieldsync</w:t>
+      </w:r>
+      <w:r>
+        <w:t xml:space="preserve"> deployments remain unchanged.</w:t>
+      </w:r>
+    </w:p>
     <w:sectPr>
       <w:pgSz w:w="12240" w:h="15840"/>
       <w:pgMar w:top="1440" w:right="1800" w:bottom="1440" w:left="1800" w:header="720" w:footer="720" w:gutter="0"/>

</xml_diff>